<commit_message>
John Travolta: revisão da Parte 5
Co-Authored-By: Claude Opus 5.5 <noreply@anthropic.com>
Claude-Session: https://claude.ai/code/session_01MJjUEEZrxQDEUifKK2vj9g
</commit_message>
<xml_diff>
--- a/roteiros/john-travolta/Travolta_Parte5.docx
+++ b/roteiros/john-travolta/Travolta_Parte5.docx
@@ -95,7 +95,7 @@
         <w:rPr>
           <w:color w:val="000000"/>
         </w:rPr>
-        <w:t>Os dois apareceram juntos nos cartazes, nas entrevistas e no tapete vermelho.</w:t>
+        <w:t>Os dois apareceram juntos nas entrevistas e no tapete vermelho.</w:t>
       </w:r>
     </w:p>
     <w:p>
@@ -104,14 +104,6 @@
           <w:color w:val="000000"/>
         </w:rPr>
         <w:t>Sorrindo.</w:t>
-      </w:r>
-    </w:p>
-    <w:p>
-      <w:r>
-        <w:rPr>
-          <w:color w:val="000000"/>
-        </w:rPr>
-        <w:t>Era a imagem de um casal que tinha atravessado a pior dor que uma família pode sentir e continuava de pé.</w:t>
       </w:r>
     </w:p>
     <w:p>
@@ -215,7 +207,7 @@
         <w:rPr>
           <w:color w:val="C00000"/>
         </w:rPr>
-        <w:t>Pense no que isso significa. Pela segunda vez na vida, John Travolta estava assistindo à mesma doença levar a mulher que ele amava. E, dessa vez, ele não podia contar para ninguém.</w:t>
+        <w:t>Pense no que isso significa. Pela segunda vez na vida, John Travolta estava assistindo à mesma doença levar a mulher que ele amava. E, dessa vez, o mundo não podia saber.</w:t>
       </w:r>
     </w:p>
     <w:p>
@@ -247,14 +239,6 @@
         <w:rPr>
           <w:color w:val="000000"/>
         </w:rPr>
-        <w:t>Enquanto isso, a vida dos Travolta seguia, aos olhos do público, normal.</w:t>
-      </w:r>
-    </w:p>
-    <w:p>
-      <w:r>
-        <w:rPr>
-          <w:color w:val="000000"/>
-        </w:rPr>
         <w:t>Ella tinha virado uma jovem de vinte anos. Benjamin, o caçula, era um menino de nove.</w:t>
       </w:r>
     </w:p>
@@ -263,7 +247,7 @@
         <w:rPr>
           <w:color w:val="000000"/>
         </w:rPr>
-        <w:t>Ninguém sabia que a mãe deles estava morrendo.</w:t>
+        <w:t>Do lado de fora, ninguém sabia que a mãe deles estava morrendo.</w:t>
       </w:r>
     </w:p>
     <w:p>
@@ -431,7 +415,7 @@
         <w:rPr>
           <w:color w:val="000000"/>
         </w:rPr>
-        <w:t>A primeira mulher que John amou, a mulher que fez o papel de mãe dele, e a última, a mãe dos filhos dele, morreram da mesma doença.</w:t>
+        <w:t>A primeira mulher que John perdeu, a que fez o papel de mãe dele, e a última, a mãe dos filhos dele, morreram da mesma doença.</w:t>
       </w:r>
     </w:p>
     <w:p>

</xml_diff>